<commit_message>
Update Blakes Planning document
if committed, this will update the planning document for Blakes data wrangling and analysis.
</commit_message>
<xml_diff>
--- a/planning documents/Blakes_Plan_for_Data_Wrangling_and_Analysis.docx
+++ b/planning documents/Blakes_Plan_for_Data_Wrangling_and_Analysis.docx
@@ -49,15 +49,37 @@
     </w:p>
     <w:p>
       <w:r>
-        <w:t>The goal is to select certain variables/case attributes within the {</w:t>
-      </w:r>
-      <w:proofErr w:type="spellStart"/>
-      <w:r>
-        <w:t>tidycensus</w:t>
-      </w:r>
-      <w:proofErr w:type="spellEnd"/>
-      <w:r>
-        <w:t xml:space="preserve">} data package, wrangle them such that we have a tidy data set ready for visualization creation, and then we will then take the tidied data and create at least 1 professional looking data table as well as at least 1 professional looking visualization that can help us explore the question: </w:t>
+        <w:t>The goal is to select certain variables/case attributes within the {tidycensus} data package, wrangle them such that we have a tidy data set ready for visualization creation, and then we will then take the tidied data and create at least 1 professional looking data table as well as at least 1 professional looking visualization that can help us explore the question</w:t>
+      </w:r>
+      <w:r>
+        <w:t>(s)</w:t>
+      </w:r>
+      <w:r>
+        <w:t>:</w:t>
+      </w:r>
+    </w:p>
+    <w:p>
+      <w:pPr>
+        <w:pStyle w:val="ListParagraph"/>
+        <w:numPr>
+          <w:ilvl w:val="0"/>
+          <w:numId w:val="4"/>
+        </w:numPr>
+      </w:pPr>
+      <w:r>
+        <w:t>How is the rise of remote work associated with income, internet access, and rent burden across Maryland counties from 2019-2022?</w:t>
+      </w:r>
+    </w:p>
+    <w:p>
+      <w:pPr>
+        <w:pStyle w:val="ListParagraph"/>
+        <w:numPr>
+          <w:ilvl w:val="0"/>
+          <w:numId w:val="4"/>
+        </w:numPr>
+      </w:pPr>
+      <w:r>
+        <w:t>Are Maryland counties with larger elderly populations (65+) experiencing higher economic strain from 2019-2022?</w:t>
       </w:r>
     </w:p>
     <w:p>
@@ -77,58 +99,10 @@
     </w:p>
     <w:p>
       <w:r>
-        <w:t>We will need the {</w:t>
-      </w:r>
-      <w:proofErr w:type="spellStart"/>
-      <w:r>
-        <w:t>tidycensus</w:t>
-      </w:r>
-      <w:proofErr w:type="spellEnd"/>
-      <w:r>
-        <w:t>} package, as well as an API key provided by the US Census Bureau to access the census data. We will also need the {</w:t>
-      </w:r>
-      <w:proofErr w:type="spellStart"/>
-      <w:r>
-        <w:t>tidyverse</w:t>
-      </w:r>
-      <w:proofErr w:type="spellEnd"/>
-      <w:r>
-        <w:t xml:space="preserve">} package as well as </w:t>
-      </w:r>
-      <w:r>
-        <w:t>{</w:t>
-      </w:r>
-      <w:proofErr w:type="spellStart"/>
-      <w:r>
-        <w:t>dplyr</w:t>
-      </w:r>
-      <w:proofErr w:type="spellEnd"/>
-      <w:r>
-        <w:t>} for data wrangling, and possibly {</w:t>
-      </w:r>
-      <w:proofErr w:type="spellStart"/>
-      <w:r>
-        <w:t>rvest</w:t>
-      </w:r>
-      <w:proofErr w:type="spellEnd"/>
-      <w:r>
-        <w:t>}. For the data tables and visualizations, we will need {</w:t>
-      </w:r>
-      <w:proofErr w:type="spellStart"/>
-      <w:r>
-        <w:t>knitr</w:t>
-      </w:r>
-      <w:proofErr w:type="spellEnd"/>
-      <w:r>
-        <w:t>}, {</w:t>
-      </w:r>
-      <w:proofErr w:type="spellStart"/>
-      <w:r>
-        <w:t>kableExtra</w:t>
-      </w:r>
-      <w:proofErr w:type="spellEnd"/>
-      <w:r>
-        <w:t>}, {ggplot2}, and possibly {scales} to assist us.</w:t>
+        <w:t xml:space="preserve">We will need the {tidycensus} package, as well as an API key provided by the US Census Bureau to access the census data. We will also need the {tidyverse} package as well as </w:t>
+      </w:r>
+      <w:r>
+        <w:t>{dplyr} for data wrangling, and possibly {rvest}. For the data tables and visualizations, we will need {knitr}, {kableExtra}, {ggplot2}, and possibly {scales} to assist us.</w:t>
       </w:r>
     </w:p>
     <w:p>
@@ -167,15 +141,7 @@
         </w:numPr>
       </w:pPr>
       <w:r>
-        <w:t>Create an EDA question about the US Census data within {</w:t>
-      </w:r>
-      <w:proofErr w:type="spellStart"/>
-      <w:r>
-        <w:t>tidycensus</w:t>
-      </w:r>
-      <w:proofErr w:type="spellEnd"/>
-      <w:r>
-        <w:t>} and select some variables that will assist us in exploring that question.</w:t>
+        <w:t>Create an EDA question about the US Census data within {tidycensus} and select some variables that will assist us in exploring that question.</w:t>
       </w:r>
     </w:p>
     <w:p>
@@ -235,15 +201,7 @@
         </w:numPr>
       </w:pPr>
       <w:r>
-        <w:t xml:space="preserve">Get data with respective parameters including year, geography, output, etc. (Using ACS 5-year </w:t>
-      </w:r>
-      <w:proofErr w:type="spellStart"/>
-      <w:r>
-        <w:t>esimates</w:t>
-      </w:r>
-      <w:proofErr w:type="spellEnd"/>
-      <w:r>
-        <w:t>)</w:t>
+        <w:t>Get data with respective parameters including year, geography, output, etc. (Using ACS 5-year esimates)</w:t>
       </w:r>
     </w:p>
     <w:p>
@@ -302,13 +260,8 @@
           <w:numId w:val="2"/>
         </w:numPr>
       </w:pPr>
-      <w:proofErr w:type="gramStart"/>
-      <w:r>
-        <w:t>Create (a)</w:t>
-      </w:r>
-      <w:proofErr w:type="gramEnd"/>
-      <w:r>
-        <w:t xml:space="preserve"> professional looking visualization(s) with all required information.</w:t>
+      <w:r>
+        <w:t>Create (a) professional looking visualization(s) with all required information.</w:t>
       </w:r>
     </w:p>
     <w:p>
@@ -348,6 +301,230 @@
 <file path=word/numbering.xml><?xml version="1.0" encoding="utf-8"?>
 <w:numbering xmlns:wpc="http://schemas.microsoft.com/office/word/2010/wordprocessingCanvas" xmlns:cx="http://schemas.microsoft.com/office/drawing/2014/chartex" xmlns:cx1="http://schemas.microsoft.com/office/drawing/2015/9/8/chartex" xmlns:cx2="http://schemas.microsoft.com/office/drawing/2015/10/21/chartex" xmlns:cx3="http://schemas.microsoft.com/office/drawing/2016/5/9/chartex" xmlns:cx4="http://schemas.microsoft.com/office/drawing/2016/5/10/chartex" xmlns:cx5="http://schemas.microsoft.com/office/drawing/2016/5/11/chartex" xmlns:cx6="http://schemas.microsoft.com/office/drawing/2016/5/12/chartex" xmlns:cx7="http://schemas.microsoft.com/office/drawing/2016/5/13/chartex" xmlns:cx8="http://schemas.microsoft.com/office/drawing/2016/5/14/chartex" xmlns:mc="http://schemas.openxmlformats.org/markup-compatibility/2006" xmlns:aink="http://schemas.microsoft.com/office/drawing/2016/ink" xmlns:am3d="http://schemas.microsoft.com/office/drawing/2017/model3d" xmlns:o="urn:schemas-microsoft-com:office:office" xmlns:oel="http://schemas.microsoft.com/office/2019/extlst" xmlns:r="http://schemas.openxmlformats.org/officeDocument/2006/relationships" xmlns:m="http://schemas.openxmlformats.org/officeDocument/2006/math" xmlns:v="urn:schemas-microsoft-com:vml" xmlns:wp14="http://schemas.microsoft.com/office/word/2010/wordprocessingDrawing" xmlns:wp="http://schemas.openxmlformats.org/drawingml/2006/wordprocessingDrawing" xmlns:w10="urn:schemas-microsoft-com:office:word" xmlns:w="http://schemas.openxmlformats.org/wordprocessingml/2006/main" xmlns:w14="http://schemas.microsoft.com/office/word/2010/wordml" xmlns:w15="http://schemas.microsoft.com/office/word/2012/wordml" xmlns:w16cex="http://schemas.microsoft.com/office/word/2018/wordml/cex" xmlns:w16cid="http://schemas.microsoft.com/office/word/2016/wordml/cid" xmlns:w16="http://schemas.microsoft.com/office/word/2018/wordml" xmlns:w16du="http://schemas.microsoft.com/office/word/2023/wordml/word16du" xmlns:w16sdtdh="http://schemas.microsoft.com/office/word/2020/wordml/sdtdatahash" xmlns:w16sdtfl="http://schemas.microsoft.com/office/word/2024/wordml/sdtformatlock" xmlns:w16se="http://schemas.microsoft.com/office/word/2015/wordml/symex" xmlns:wpg="http://schemas.microsoft.com/office/word/2010/wordprocessingGroup" xmlns:wpi="http://schemas.microsoft.com/office/word/2010/wordprocessingInk" xmlns:wne="http://schemas.microsoft.com/office/word/2006/wordml" xmlns:wps="http://schemas.microsoft.com/office/word/2010/wordprocessingShape" mc:Ignorable="w14 w15 w16se w16cid w16 w16cex w16sdtdh w16sdtfl w16du wp14">
   <w:abstractNum w:abstractNumId="0" w15:restartNumberingAfterBreak="0">
+    <w:nsid w:val="54DE0EDC"/>
+    <w:multiLevelType w:val="hybridMultilevel"/>
+    <w:tmpl w:val="42563690"/>
+    <w:lvl w:ilvl="0" w:tplc="5E7AF66C">
+      <w:numFmt w:val="bullet"/>
+      <w:lvlText w:val="-"/>
+      <w:lvlJc w:val="left"/>
+      <w:pPr>
+        <w:ind w:left="720" w:hanging="360"/>
+      </w:pPr>
+      <w:rPr>
+        <w:rFonts w:ascii="Aptos" w:eastAsiaTheme="minorHAnsi" w:hAnsi="Aptos" w:cstheme="minorBidi" w:hint="default"/>
+      </w:rPr>
+    </w:lvl>
+    <w:lvl w:ilvl="1" w:tplc="04090003" w:tentative="1">
+      <w:start w:val="1"/>
+      <w:numFmt w:val="bullet"/>
+      <w:lvlText w:val="o"/>
+      <w:lvlJc w:val="left"/>
+      <w:pPr>
+        <w:ind w:left="1440" w:hanging="360"/>
+      </w:pPr>
+      <w:rPr>
+        <w:rFonts w:ascii="Courier New" w:hAnsi="Courier New" w:cs="Courier New" w:hint="default"/>
+      </w:rPr>
+    </w:lvl>
+    <w:lvl w:ilvl="2" w:tplc="04090005" w:tentative="1">
+      <w:start w:val="1"/>
+      <w:numFmt w:val="bullet"/>
+      <w:lvlText w:val=""/>
+      <w:lvlJc w:val="left"/>
+      <w:pPr>
+        <w:ind w:left="2160" w:hanging="360"/>
+      </w:pPr>
+      <w:rPr>
+        <w:rFonts w:ascii="Wingdings" w:hAnsi="Wingdings" w:hint="default"/>
+      </w:rPr>
+    </w:lvl>
+    <w:lvl w:ilvl="3" w:tplc="04090001" w:tentative="1">
+      <w:start w:val="1"/>
+      <w:numFmt w:val="bullet"/>
+      <w:lvlText w:val=""/>
+      <w:lvlJc w:val="left"/>
+      <w:pPr>
+        <w:ind w:left="2880" w:hanging="360"/>
+      </w:pPr>
+      <w:rPr>
+        <w:rFonts w:ascii="Symbol" w:hAnsi="Symbol" w:hint="default"/>
+      </w:rPr>
+    </w:lvl>
+    <w:lvl w:ilvl="4" w:tplc="04090003" w:tentative="1">
+      <w:start w:val="1"/>
+      <w:numFmt w:val="bullet"/>
+      <w:lvlText w:val="o"/>
+      <w:lvlJc w:val="left"/>
+      <w:pPr>
+        <w:ind w:left="3600" w:hanging="360"/>
+      </w:pPr>
+      <w:rPr>
+        <w:rFonts w:ascii="Courier New" w:hAnsi="Courier New" w:cs="Courier New" w:hint="default"/>
+      </w:rPr>
+    </w:lvl>
+    <w:lvl w:ilvl="5" w:tplc="04090005" w:tentative="1">
+      <w:start w:val="1"/>
+      <w:numFmt w:val="bullet"/>
+      <w:lvlText w:val=""/>
+      <w:lvlJc w:val="left"/>
+      <w:pPr>
+        <w:ind w:left="4320" w:hanging="360"/>
+      </w:pPr>
+      <w:rPr>
+        <w:rFonts w:ascii="Wingdings" w:hAnsi="Wingdings" w:hint="default"/>
+      </w:rPr>
+    </w:lvl>
+    <w:lvl w:ilvl="6" w:tplc="04090001" w:tentative="1">
+      <w:start w:val="1"/>
+      <w:numFmt w:val="bullet"/>
+      <w:lvlText w:val=""/>
+      <w:lvlJc w:val="left"/>
+      <w:pPr>
+        <w:ind w:left="5040" w:hanging="360"/>
+      </w:pPr>
+      <w:rPr>
+        <w:rFonts w:ascii="Symbol" w:hAnsi="Symbol" w:hint="default"/>
+      </w:rPr>
+    </w:lvl>
+    <w:lvl w:ilvl="7" w:tplc="04090003" w:tentative="1">
+      <w:start w:val="1"/>
+      <w:numFmt w:val="bullet"/>
+      <w:lvlText w:val="o"/>
+      <w:lvlJc w:val="left"/>
+      <w:pPr>
+        <w:ind w:left="5760" w:hanging="360"/>
+      </w:pPr>
+      <w:rPr>
+        <w:rFonts w:ascii="Courier New" w:hAnsi="Courier New" w:cs="Courier New" w:hint="default"/>
+      </w:rPr>
+    </w:lvl>
+    <w:lvl w:ilvl="8" w:tplc="04090005" w:tentative="1">
+      <w:start w:val="1"/>
+      <w:numFmt w:val="bullet"/>
+      <w:lvlText w:val=""/>
+      <w:lvlJc w:val="left"/>
+      <w:pPr>
+        <w:ind w:left="6480" w:hanging="360"/>
+      </w:pPr>
+      <w:rPr>
+        <w:rFonts w:ascii="Wingdings" w:hAnsi="Wingdings" w:hint="default"/>
+      </w:rPr>
+    </w:lvl>
+  </w:abstractNum>
+  <w:abstractNum w:abstractNumId="1" w15:restartNumberingAfterBreak="0">
+    <w:nsid w:val="6243771F"/>
+    <w:multiLevelType w:val="hybridMultilevel"/>
+    <w:tmpl w:val="4F281EF4"/>
+    <w:lvl w:ilvl="0" w:tplc="5E7AF66C">
+      <w:numFmt w:val="bullet"/>
+      <w:lvlText w:val="-"/>
+      <w:lvlJc w:val="left"/>
+      <w:pPr>
+        <w:ind w:left="765" w:hanging="360"/>
+      </w:pPr>
+      <w:rPr>
+        <w:rFonts w:ascii="Aptos" w:eastAsiaTheme="minorHAnsi" w:hAnsi="Aptos" w:cstheme="minorBidi" w:hint="default"/>
+      </w:rPr>
+    </w:lvl>
+    <w:lvl w:ilvl="1" w:tplc="04090003" w:tentative="1">
+      <w:start w:val="1"/>
+      <w:numFmt w:val="bullet"/>
+      <w:lvlText w:val="o"/>
+      <w:lvlJc w:val="left"/>
+      <w:pPr>
+        <w:ind w:left="1485" w:hanging="360"/>
+      </w:pPr>
+      <w:rPr>
+        <w:rFonts w:ascii="Courier New" w:hAnsi="Courier New" w:cs="Courier New" w:hint="default"/>
+      </w:rPr>
+    </w:lvl>
+    <w:lvl w:ilvl="2" w:tplc="04090005" w:tentative="1">
+      <w:start w:val="1"/>
+      <w:numFmt w:val="bullet"/>
+      <w:lvlText w:val=""/>
+      <w:lvlJc w:val="left"/>
+      <w:pPr>
+        <w:ind w:left="2205" w:hanging="360"/>
+      </w:pPr>
+      <w:rPr>
+        <w:rFonts w:ascii="Wingdings" w:hAnsi="Wingdings" w:hint="default"/>
+      </w:rPr>
+    </w:lvl>
+    <w:lvl w:ilvl="3" w:tplc="04090001" w:tentative="1">
+      <w:start w:val="1"/>
+      <w:numFmt w:val="bullet"/>
+      <w:lvlText w:val=""/>
+      <w:lvlJc w:val="left"/>
+      <w:pPr>
+        <w:ind w:left="2925" w:hanging="360"/>
+      </w:pPr>
+      <w:rPr>
+        <w:rFonts w:ascii="Symbol" w:hAnsi="Symbol" w:hint="default"/>
+      </w:rPr>
+    </w:lvl>
+    <w:lvl w:ilvl="4" w:tplc="04090003" w:tentative="1">
+      <w:start w:val="1"/>
+      <w:numFmt w:val="bullet"/>
+      <w:lvlText w:val="o"/>
+      <w:lvlJc w:val="left"/>
+      <w:pPr>
+        <w:ind w:left="3645" w:hanging="360"/>
+      </w:pPr>
+      <w:rPr>
+        <w:rFonts w:ascii="Courier New" w:hAnsi="Courier New" w:cs="Courier New" w:hint="default"/>
+      </w:rPr>
+    </w:lvl>
+    <w:lvl w:ilvl="5" w:tplc="04090005" w:tentative="1">
+      <w:start w:val="1"/>
+      <w:numFmt w:val="bullet"/>
+      <w:lvlText w:val=""/>
+      <w:lvlJc w:val="left"/>
+      <w:pPr>
+        <w:ind w:left="4365" w:hanging="360"/>
+      </w:pPr>
+      <w:rPr>
+        <w:rFonts w:ascii="Wingdings" w:hAnsi="Wingdings" w:hint="default"/>
+      </w:rPr>
+    </w:lvl>
+    <w:lvl w:ilvl="6" w:tplc="04090001" w:tentative="1">
+      <w:start w:val="1"/>
+      <w:numFmt w:val="bullet"/>
+      <w:lvlText w:val=""/>
+      <w:lvlJc w:val="left"/>
+      <w:pPr>
+        <w:ind w:left="5085" w:hanging="360"/>
+      </w:pPr>
+      <w:rPr>
+        <w:rFonts w:ascii="Symbol" w:hAnsi="Symbol" w:hint="default"/>
+      </w:rPr>
+    </w:lvl>
+    <w:lvl w:ilvl="7" w:tplc="04090003" w:tentative="1">
+      <w:start w:val="1"/>
+      <w:numFmt w:val="bullet"/>
+      <w:lvlText w:val="o"/>
+      <w:lvlJc w:val="left"/>
+      <w:pPr>
+        <w:ind w:left="5805" w:hanging="360"/>
+      </w:pPr>
+      <w:rPr>
+        <w:rFonts w:ascii="Courier New" w:hAnsi="Courier New" w:cs="Courier New" w:hint="default"/>
+      </w:rPr>
+    </w:lvl>
+    <w:lvl w:ilvl="8" w:tplc="04090005" w:tentative="1">
+      <w:start w:val="1"/>
+      <w:numFmt w:val="bullet"/>
+      <w:lvlText w:val=""/>
+      <w:lvlJc w:val="left"/>
+      <w:pPr>
+        <w:ind w:left="6525" w:hanging="360"/>
+      </w:pPr>
+      <w:rPr>
+        <w:rFonts w:ascii="Wingdings" w:hAnsi="Wingdings" w:hint="default"/>
+      </w:rPr>
+    </w:lvl>
+  </w:abstractNum>
+  <w:abstractNum w:abstractNumId="2" w15:restartNumberingAfterBreak="0">
     <w:nsid w:val="65A81976"/>
     <w:multiLevelType w:val="hybridMultilevel"/>
     <w:tmpl w:val="8EEA0A0A"/>
@@ -434,7 +611,7 @@
     </w:lvl>
   </w:abstractNum>
   <w:num w:numId="1" w16cid:durableId="2099060118">
-    <w:abstractNumId w:val="0"/>
+    <w:abstractNumId w:val="2"/>
     <w:lvlOverride w:ilvl="0">
       <w:startOverride w:val="1"/>
     </w:lvlOverride>
@@ -464,7 +641,13 @@
     </w:lvlOverride>
   </w:num>
   <w:num w:numId="2" w16cid:durableId="1683358064">
+    <w:abstractNumId w:val="2"/>
+  </w:num>
+  <w:num w:numId="3" w16cid:durableId="447430263">
     <w:abstractNumId w:val="0"/>
+  </w:num>
+  <w:num w:numId="4" w16cid:durableId="89274580">
+    <w:abstractNumId w:val="1"/>
   </w:num>
 </w:numbering>
 </file>
@@ -1073,6 +1256,7 @@
   <w:style w:type="character" w:default="1" w:styleId="DefaultParagraphFont">
     <w:name w:val="Default Paragraph Font"/>
     <w:uiPriority w:val="1"/>
+    <w:semiHidden/>
     <w:unhideWhenUsed/>
   </w:style>
   <w:style w:type="table" w:default="1" w:styleId="TableNormal">

</xml_diff>